<commit_message>
Release ZgData Toolkit 1.2.0 Apross monitor
</commit_message>
<xml_diff>
--- a/ZgData_Toolkit_Kratke_upute.docx
+++ b/ZgData_Toolkit_Kratke_upute.docx
@@ -166,10 +166,7 @@
         <w:jc w:val="center"/>
       </w:pPr>
       <w:r>
-        <w:rPr>
-          <w:b/>
-        </w:rPr>
-        <w:t>Verzija dokumenta 1.1.0</w:t>
+        <w:t>Verzija dokumenta 1.2.0</w:t>
       </w:r>
     </w:p>
     <w:p>
@@ -177,12 +174,7 @@
         <w:jc w:val="center"/>
       </w:pPr>
       <w:r>
-        <w:rPr>
-          <w:b/>
-          <w:color w:val="2563EB"/>
-          <w:sz w:val="20"/>
-        </w:rPr>
-        <w:t>Izdanje 1.1.0 - Multi-cloud dijagnostika</w:t>
+        <w:t>Izdanje 1.2.0 - Apross Client Monitor i SQL korelacija</w:t>
       </w:r>
     </w:p>
     <w:p>
@@ -280,7 +272,7 @@
         <w:spacing w:before="0" w:after="100" w:line="264" w:lineRule="auto"/>
       </w:pPr>
       <w:r>
-        <w:t>ZgData Toolkit je prijenosni alat za osnovnu i proširenu provjeru internetske veze, dostupnosti ZgData servisa, usporedbu više cloud dijagnostičkih ruta i provjeru SQL TCP porta kod korisnika. Pokreće se na korisničkom računalu, bez instalacije, a nakon testa izrađuje HTML izvještaj koji se može poslati kolegi na daljnju analizu.</w:t>
+        <w:t>ZgData Toolkit je prijenosni alat za osnovnu i proširenu provjeru internetske veze, dostupnosti ZgData servisa, usporedbu više cloud dijagnostičkih ruta, provjeru SQL TCP porta te nadzor lokalno pokrenutih aplikacija. Od verzije 1.2.0 uključen je Apross Client Monitor koji povezuje lokalni Apross proces, njegove pomoćne procese, TCP endpointove, procesne resurse i opcionalnu SQL live korelaciju u jedinstveni dijagnostički izvještaj.</w:t>
       </w:r>
     </w:p>
     <w:p>
@@ -5350,6 +5342,113 @@
         <w:pStyle w:val="Heading2"/>
       </w:pPr>
       <w:r>
+        <w:rPr>
+          <w:b/>
+        </w:rPr>
+        <w:t>Verzija 1.2.0 - Apross Client Monitor i SQL korelacija (15.07.2026.)</w:t>
+      </w:r>
+    </w:p>
+    <w:p>
+      <w:pPr>
+        <w:pStyle w:val="ListBullet"/>
+      </w:pPr>
+      <w:r>
+        <w:t>Dodan Apross Client Monitor za praćenje lokalno pokrenutog Apross.exe procesa.</w:t>
+      </w:r>
+    </w:p>
+    <w:p>
+      <w:pPr>
+        <w:pStyle w:val="ListBullet"/>
+      </w:pPr>
+      <w:r>
+        <w:t>Dodano praćenje child procesa, WebView2 i pomoćnih report/browser procesa.</w:t>
+      </w:r>
+    </w:p>
+    <w:p>
+      <w:pPr>
+        <w:pStyle w:val="ListBullet"/>
+      </w:pPr>
+      <w:r>
+        <w:t>Dodano praćenje CPU-a, RAM-a, private memoryja, handleova, GDI/USER objekata i Not responding stanja.</w:t>
+      </w:r>
+    </w:p>
+    <w:p>
+      <w:pPr>
+        <w:pStyle w:val="ListBullet"/>
+      </w:pPr>
+      <w:r>
+        <w:t>Dodano povezivanje TCP veza s procesom i klasifikacija SQL, Web/API, file-share i ostalih endpointova.</w:t>
+      </w:r>
+    </w:p>
+    <w:p>
+      <w:pPr>
+        <w:pStyle w:val="ListBullet"/>
+      </w:pPr>
+      <w:r>
+        <w:t>Dodana oznaka lokalnog/LAN i javnog/cloud backenda.</w:t>
+      </w:r>
+    </w:p>
+    <w:p>
+      <w:pPr>
+        <w:pStyle w:val="ListBullet"/>
+      </w:pPr>
+      <w:r>
+        <w:t>Dodan gumb Problem happened za označavanje točnog trenutka zastoja.</w:t>
+      </w:r>
+    </w:p>
+    <w:p>
+      <w:pPr>
+        <w:pStyle w:val="ListBullet"/>
+      </w:pPr>
+      <w:r>
+        <w:t>Dodani HTML report i CSV izvozi za procese, konekcije, timeline i SQL korelaciju.</w:t>
+      </w:r>
+    </w:p>
+    <w:p>
+      <w:pPr>
+        <w:pStyle w:val="ListBullet"/>
+      </w:pPr>
+      <w:r>
+        <w:t>Dodana opcionalna SQL live correlation analiza: SPID, login, baza, command, wait, blocking, trajanje, reads/writes i SQL tekst.</w:t>
+      </w:r>
+    </w:p>
+    <w:p>
+      <w:pPr>
+        <w:pStyle w:val="ListBullet"/>
+      </w:pPr>
+      <w:r>
+        <w:t>Razdvojeni su Windows user, Apross application user i SQL monitoring login.</w:t>
+      </w:r>
+    </w:p>
+    <w:p>
+      <w:pPr>
+        <w:pStyle w:val="ListBullet"/>
+      </w:pPr>
+      <w:r>
+        <w:t>Dodane SQL Server skripte za provjeru i dodjelu minimalnih monitoring prava.</w:t>
+      </w:r>
+    </w:p>
+    <w:p>
+      <w:pPr>
+        <w:pStyle w:val="ListBullet"/>
+      </w:pPr>
+      <w:r>
+        <w:t>Ispravljene su greške connection stringa, SQL varijabli i prazne datoteke lokalnih portova.</w:t>
+      </w:r>
+    </w:p>
+    <w:p>
+      <w:pPr>
+        <w:pStyle w:val="ListBullet"/>
+      </w:pPr>
+      <w:r>
+        <w:t>SQL lozinka se ne sprema u report, CSV, settings.json ni source kod.</w:t>
+      </w:r>
+    </w:p>
+    <w:p>
+      <w:pPr>
+        <w:pStyle w:val="Heading2"/>
+      </w:pPr>
+      <w:r>
         <w:t>Verzija 1.1.0 - Multi-cloud izdanje (14.07.2026.)</w:t>
       </w:r>
     </w:p>
@@ -5489,6 +5588,1886 @@
         <w:t>Self-contained Windows x64 publish paket.</w:t>
       </w:r>
     </w:p>
+    <w:p>
+      <w:r>
+        <w:br w:type="page"/>
+      </w:r>
+    </w:p>
+    <w:p>
+      <w:pPr>
+        <w:pStyle w:val="Heading1"/>
+      </w:pPr>
+      <w:r>
+        <w:t>21. Apross Client Monitor</w:t>
+      </w:r>
+    </w:p>
+    <w:p>
+      <w:r>
+        <w:t>Apross Client Monitor radi kao vanjski dijagnostički modul na istom Windows računalu na kojem je pokrenut Apross.exe. Ne mijenja Apross, ne učitava dodatak u njegov proces i ne zahtijeva promjenu klijentske instalacije. Cilj mu je povezati ponašanje lokalnog procesa, mrežne veze i SQL aktivnost s točnim trenutkom u kojem korisnik primijeti zastoj.</w:t>
+      </w:r>
+    </w:p>
+    <w:tbl>
+      <w:tblPr>
+        <w:tblW w:type="auto" w:w="0"/>
+        <w:jc w:val="center"/>
+        <w:tblLook w:firstColumn="1" w:firstRow="1" w:lastColumn="0" w:lastRow="0" w:noHBand="0" w:noVBand="1" w:val="04A0"/>
+      </w:tblPr>
+      <w:tblGrid>
+        <w:gridCol w:w="9978"/>
+      </w:tblGrid>
+      <w:tr>
+        <w:tc>
+          <w:tcPr>
+            <w:tcW w:type="dxa" w:w="9978"/>
+            <w:shd w:fill="E8F5E9"/>
+          </w:tcPr>
+          <w:p>
+            <w:r>
+              <w:rPr>
+                <w:b/>
+                <w:sz w:val="18"/>
+              </w:rPr>
+              <w:t>Važno</w:t>
+              <w:br/>
+            </w:r>
+            <w:r>
+              <w:rPr>
+                <w:sz w:val="18"/>
+              </w:rPr>
+              <w:t>Apross je client-based aplikacija. Toolkit se pokreće lokalno na korisničkom računalu na kojem radi Apross.exe. SQL, reporti i web servisi mogu biti lokalni, u LAN-u ili u cloudu.</w:t>
+            </w:r>
+          </w:p>
+        </w:tc>
+      </w:tr>
+    </w:tbl>
+    <w:p>
+      <w:pPr>
+        <w:pStyle w:val="Heading1"/>
+      </w:pPr>
+      <w:r>
+        <w:t>22. Pokretanje i odabir procesa</w:t>
+      </w:r>
+    </w:p>
+    <w:p>
+      <w:pPr>
+        <w:pStyle w:val="ListNumber"/>
+      </w:pPr>
+      <w:r>
+        <w:t>Pokrenite Apross i prijavite se u aplikaciju.</w:t>
+      </w:r>
+    </w:p>
+    <w:p>
+      <w:pPr>
+        <w:pStyle w:val="ListNumber"/>
+      </w:pPr>
+      <w:r>
+        <w:t>U glavnom prozoru ZgData Toolkita otvorite APROSS MONITOR.</w:t>
+      </w:r>
+    </w:p>
+    <w:p>
+      <w:pPr>
+        <w:pStyle w:val="ListNumber"/>
+      </w:pPr>
+      <w:r>
+        <w:t>U polju Process search ostavite apross i kliknite REFRESH PROCESSES.</w:t>
+      </w:r>
+    </w:p>
+    <w:p>
+      <w:pPr>
+        <w:pStyle w:val="ListNumber"/>
+      </w:pPr>
+      <w:r>
+        <w:t>Odaberite pravi Apross proces prema PID-u, Windows korisniku, vremenu pokretanja i naslovu prozora.</w:t>
+      </w:r>
+    </w:p>
+    <w:p>
+      <w:pPr>
+        <w:pStyle w:val="ListNumber"/>
+      </w:pPr>
+      <w:r>
+        <w:t>U polje Apross application user upišite korisnika koji je prijavljen unutar Aprossa.</w:t>
+      </w:r>
+    </w:p>
+    <w:p>
+      <w:pPr>
+        <w:pStyle w:val="ListNumber"/>
+      </w:pPr>
+      <w:r>
+        <w:t>Ostavite uključeno Track child processes / WebView2.</w:t>
+      </w:r>
+    </w:p>
+    <w:p>
+      <w:pPr>
+        <w:pStyle w:val="ListNumber"/>
+      </w:pPr>
+      <w:r>
+        <w:t>Za početno testiranje ostavite Detailed packet trace isključen.</w:t>
+      </w:r>
+    </w:p>
+    <w:p>
+      <w:pPr>
+        <w:pStyle w:val="ListNumber"/>
+      </w:pPr>
+      <w:r>
+        <w:t>Kliknite START MONITORING i zatim normalno radite u Aprossu.</w:t>
+      </w:r>
+    </w:p>
+    <w:p/>
+    <w:p>
+      <w:pPr>
+        <w:jc w:val="center"/>
+      </w:pPr>
+      <w:r>
+        <w:drawing>
+          <wp:inline xmlns:a="http://schemas.openxmlformats.org/drawingml/2006/main" xmlns:pic="http://schemas.openxmlformats.org/drawingml/2006/picture">
+            <wp:extent cx="6126480" cy="2402668"/>
+            <wp:docPr id="4" name="Picture 4"/>
+            <wp:cNvGraphicFramePr>
+              <a:graphicFrameLocks noChangeAspect="1"/>
+            </wp:cNvGraphicFramePr>
+            <a:graphic>
+              <a:graphicData uri="http://schemas.openxmlformats.org/drawingml/2006/picture">
+                <pic:pic>
+                  <pic:nvPicPr>
+                    <pic:cNvPr id="0" name="22986979-1bd3-4480-af50-a5020d2431c5.png"/>
+                    <pic:cNvPicPr/>
+                  </pic:nvPicPr>
+                  <pic:blipFill>
+                    <a:blip r:embed="rId14"/>
+                    <a:stretch>
+                      <a:fillRect/>
+                    </a:stretch>
+                  </pic:blipFill>
+                  <pic:spPr>
+                    <a:xfrm>
+                      <a:off x="0" y="0"/>
+                      <a:ext cx="6126480" cy="2402668"/>
+                    </a:xfrm>
+                    <a:prstGeom prst="rect"/>
+                  </pic:spPr>
+                </pic:pic>
+              </a:graphicData>
+            </a:graphic>
+          </wp:inline>
+        </w:drawing>
+      </w:r>
+    </w:p>
+    <w:p>
+      <w:pPr>
+        <w:pStyle w:val="Caption"/>
+        <w:jc w:val="center"/>
+      </w:pPr>
+      <w:r>
+        <w:t>Primjer Apross Client Monitor prozora s uspješnim SQL pristupom i odabranim lokalnim Apross procesom.</w:t>
+      </w:r>
+    </w:p>
+    <w:p>
+      <w:pPr>
+        <w:pStyle w:val="Heading1"/>
+      </w:pPr>
+      <w:r>
+        <w:t>23. Što se prati</w:t>
+      </w:r>
+    </w:p>
+    <w:tbl>
+      <w:tblPr>
+        <w:tblStyle w:val="TableGrid"/>
+        <w:tblW w:type="auto" w:w="0"/>
+        <w:jc w:val="center"/>
+        <w:tblLook w:firstColumn="1" w:firstRow="1" w:lastColumn="0" w:lastRow="0" w:noHBand="0" w:noVBand="1" w:val="04A0"/>
+      </w:tblPr>
+      <w:tblGrid>
+        <w:gridCol w:w="3326"/>
+        <w:gridCol w:w="3326"/>
+        <w:gridCol w:w="3326"/>
+      </w:tblGrid>
+      <w:tr>
+        <w:trPr>
+          <w:tblHeader/>
+        </w:trPr>
+        <w:tc>
+          <w:tcPr>
+            <w:tcW w:type="dxa" w:w="3326"/>
+            <w:shd w:fill="0B1B38"/>
+            <w:vAlign w:val="center"/>
+          </w:tcPr>
+          <w:p>
+            <w:pPr>
+              <w:spacing w:after="40"/>
+            </w:pPr>
+            <w:r>
+              <w:rPr>
+                <w:b/>
+                <w:color w:val="FFFFFF"/>
+                <w:sz w:val="17"/>
+              </w:rPr>
+              <w:t>Područje</w:t>
+            </w:r>
+          </w:p>
+        </w:tc>
+        <w:tc>
+          <w:tcPr>
+            <w:tcW w:type="dxa" w:w="3326"/>
+            <w:shd w:fill="0B1B38"/>
+            <w:vAlign w:val="center"/>
+          </w:tcPr>
+          <w:p>
+            <w:pPr>
+              <w:spacing w:after="40"/>
+            </w:pPr>
+            <w:r>
+              <w:rPr>
+                <w:b/>
+                <w:color w:val="FFFFFF"/>
+                <w:sz w:val="17"/>
+              </w:rPr>
+              <w:t>Podaci</w:t>
+            </w:r>
+          </w:p>
+        </w:tc>
+        <w:tc>
+          <w:tcPr>
+            <w:tcW w:type="dxa" w:w="3326"/>
+            <w:shd w:fill="0B1B38"/>
+            <w:vAlign w:val="center"/>
+          </w:tcPr>
+          <w:p>
+            <w:pPr>
+              <w:spacing w:after="40"/>
+            </w:pPr>
+            <w:r>
+              <w:rPr>
+                <w:b/>
+                <w:color w:val="FFFFFF"/>
+                <w:sz w:val="17"/>
+              </w:rPr>
+              <w:t>Čemu služi</w:t>
+            </w:r>
+          </w:p>
+        </w:tc>
+      </w:tr>
+      <w:tr>
+        <w:tc>
+          <w:tcPr>
+            <w:tcW w:type="dxa" w:w="3326"/>
+            <w:vAlign w:val="center"/>
+          </w:tcPr>
+          <w:p>
+            <w:pPr>
+              <w:spacing w:after="40"/>
+            </w:pPr>
+            <w:r>
+              <w:rPr>
+                <w:sz w:val="17"/>
+              </w:rPr>
+              <w:t>Proces</w:t>
+            </w:r>
+          </w:p>
+        </w:tc>
+        <w:tc>
+          <w:tcPr>
+            <w:tcW w:type="dxa" w:w="3326"/>
+            <w:vAlign w:val="center"/>
+          </w:tcPr>
+          <w:p>
+            <w:pPr>
+              <w:spacing w:after="40"/>
+            </w:pPr>
+            <w:r>
+              <w:rPr>
+                <w:sz w:val="17"/>
+              </w:rPr>
+              <w:t>PID, Windows user, start time, window title</w:t>
+            </w:r>
+          </w:p>
+        </w:tc>
+        <w:tc>
+          <w:tcPr>
+            <w:tcW w:type="dxa" w:w="3326"/>
+            <w:vAlign w:val="center"/>
+          </w:tcPr>
+          <w:p>
+            <w:pPr>
+              <w:spacing w:after="40"/>
+            </w:pPr>
+            <w:r>
+              <w:rPr>
+                <w:sz w:val="17"/>
+              </w:rPr>
+              <w:t>Potvrda da se prati prava lokalna instanca Aprossa.</w:t>
+            </w:r>
+          </w:p>
+        </w:tc>
+      </w:tr>
+      <w:tr>
+        <w:tc>
+          <w:tcPr>
+            <w:tcW w:type="dxa" w:w="3326"/>
+            <w:vAlign w:val="center"/>
+          </w:tcPr>
+          <w:p>
+            <w:pPr>
+              <w:spacing w:after="40"/>
+            </w:pPr>
+            <w:r>
+              <w:rPr>
+                <w:sz w:val="17"/>
+              </w:rPr>
+              <w:t>Resursi</w:t>
+            </w:r>
+          </w:p>
+        </w:tc>
+        <w:tc>
+          <w:tcPr>
+            <w:tcW w:type="dxa" w:w="3326"/>
+            <w:vAlign w:val="center"/>
+          </w:tcPr>
+          <w:p>
+            <w:pPr>
+              <w:spacing w:after="40"/>
+            </w:pPr>
+            <w:r>
+              <w:rPr>
+                <w:sz w:val="17"/>
+              </w:rPr>
+              <w:t>CPU, RAM, private memory, handles, GDI, USER</w:t>
+            </w:r>
+          </w:p>
+        </w:tc>
+        <w:tc>
+          <w:tcPr>
+            <w:tcW w:type="dxa" w:w="3326"/>
+            <w:vAlign w:val="center"/>
+          </w:tcPr>
+          <w:p>
+            <w:pPr>
+              <w:spacing w:after="40"/>
+            </w:pPr>
+            <w:r>
+              <w:rPr>
+                <w:sz w:val="17"/>
+              </w:rPr>
+              <w:t>Otkrivanje lokalnog zagušenja, curenja resursa i rasta memorije.</w:t>
+            </w:r>
+          </w:p>
+        </w:tc>
+      </w:tr>
+      <w:tr>
+        <w:tc>
+          <w:tcPr>
+            <w:tcW w:type="dxa" w:w="3326"/>
+            <w:vAlign w:val="center"/>
+          </w:tcPr>
+          <w:p>
+            <w:pPr>
+              <w:spacing w:after="40"/>
+            </w:pPr>
+            <w:r>
+              <w:rPr>
+                <w:sz w:val="17"/>
+              </w:rPr>
+              <w:t>UI stanje</w:t>
+            </w:r>
+          </w:p>
+        </w:tc>
+        <w:tc>
+          <w:tcPr>
+            <w:tcW w:type="dxa" w:w="3326"/>
+            <w:vAlign w:val="center"/>
+          </w:tcPr>
+          <w:p>
+            <w:pPr>
+              <w:spacing w:after="40"/>
+            </w:pPr>
+            <w:r>
+              <w:rPr>
+                <w:sz w:val="17"/>
+              </w:rPr>
+              <w:t>Responding / Not responding</w:t>
+            </w:r>
+          </w:p>
+        </w:tc>
+        <w:tc>
+          <w:tcPr>
+            <w:tcW w:type="dxa" w:w="3326"/>
+            <w:vAlign w:val="center"/>
+          </w:tcPr>
+          <w:p>
+            <w:pPr>
+              <w:spacing w:after="40"/>
+            </w:pPr>
+            <w:r>
+              <w:rPr>
+                <w:sz w:val="17"/>
+              </w:rPr>
+              <w:t>Vremensko povezivanje zamrzavanja prozora s mrežnim ili SQL događajem.</w:t>
+            </w:r>
+          </w:p>
+        </w:tc>
+      </w:tr>
+      <w:tr>
+        <w:tc>
+          <w:tcPr>
+            <w:tcW w:type="dxa" w:w="3326"/>
+            <w:vAlign w:val="center"/>
+          </w:tcPr>
+          <w:p>
+            <w:pPr>
+              <w:spacing w:after="40"/>
+            </w:pPr>
+            <w:r>
+              <w:rPr>
+                <w:sz w:val="17"/>
+              </w:rPr>
+              <w:t>Child procesi</w:t>
+            </w:r>
+          </w:p>
+        </w:tc>
+        <w:tc>
+          <w:tcPr>
+            <w:tcW w:type="dxa" w:w="3326"/>
+            <w:vAlign w:val="center"/>
+          </w:tcPr>
+          <w:p>
+            <w:pPr>
+              <w:spacing w:after="40"/>
+            </w:pPr>
+            <w:r>
+              <w:rPr>
+                <w:sz w:val="17"/>
+              </w:rPr>
+              <w:t>WebView2, browser/report helperi</w:t>
+            </w:r>
+          </w:p>
+        </w:tc>
+        <w:tc>
+          <w:tcPr>
+            <w:tcW w:type="dxa" w:w="3326"/>
+            <w:vAlign w:val="center"/>
+          </w:tcPr>
+          <w:p>
+            <w:pPr>
+              <w:spacing w:after="40"/>
+            </w:pPr>
+            <w:r>
+              <w:rPr>
+                <w:sz w:val="17"/>
+              </w:rPr>
+              <w:t>Praćenje web aplikacija i reporta koji se ne izvršavaju u glavnom Apross procesu.</w:t>
+            </w:r>
+          </w:p>
+        </w:tc>
+      </w:tr>
+      <w:tr>
+        <w:tc>
+          <w:tcPr>
+            <w:tcW w:type="dxa" w:w="3326"/>
+            <w:vAlign w:val="center"/>
+          </w:tcPr>
+          <w:p>
+            <w:pPr>
+              <w:spacing w:after="40"/>
+            </w:pPr>
+            <w:r>
+              <w:rPr>
+                <w:sz w:val="17"/>
+              </w:rPr>
+              <w:t>TCP veze</w:t>
+            </w:r>
+          </w:p>
+        </w:tc>
+        <w:tc>
+          <w:tcPr>
+            <w:tcW w:type="dxa" w:w="3326"/>
+            <w:vAlign w:val="center"/>
+          </w:tcPr>
+          <w:p>
+            <w:pPr>
+              <w:spacing w:after="40"/>
+            </w:pPr>
+            <w:r>
+              <w:rPr>
+                <w:sz w:val="17"/>
+              </w:rPr>
+              <w:t>Lokalni i udaljeni IP/port, state, trajanje</w:t>
+            </w:r>
+          </w:p>
+        </w:tc>
+        <w:tc>
+          <w:tcPr>
+            <w:tcW w:type="dxa" w:w="3326"/>
+            <w:vAlign w:val="center"/>
+          </w:tcPr>
+          <w:p>
+            <w:pPr>
+              <w:spacing w:after="40"/>
+            </w:pPr>
+            <w:r>
+              <w:rPr>
+                <w:sz w:val="17"/>
+              </w:rPr>
+              <w:t>Otkrivanje SQL, Web/API, file-share i drugih endpointova.</w:t>
+            </w:r>
+          </w:p>
+        </w:tc>
+      </w:tr>
+      <w:tr>
+        <w:tc>
+          <w:tcPr>
+            <w:tcW w:type="dxa" w:w="3326"/>
+            <w:vAlign w:val="center"/>
+          </w:tcPr>
+          <w:p>
+            <w:pPr>
+              <w:spacing w:after="40"/>
+            </w:pPr>
+            <w:r>
+              <w:rPr>
+                <w:sz w:val="17"/>
+              </w:rPr>
+              <w:t>Incident marker</w:t>
+            </w:r>
+          </w:p>
+        </w:tc>
+        <w:tc>
+          <w:tcPr>
+            <w:tcW w:type="dxa" w:w="3326"/>
+            <w:vAlign w:val="center"/>
+          </w:tcPr>
+          <w:p>
+            <w:pPr>
+              <w:spacing w:after="40"/>
+            </w:pPr>
+            <w:r>
+              <w:rPr>
+                <w:sz w:val="17"/>
+              </w:rPr>
+              <w:t>Problem happened + bilješka</w:t>
+            </w:r>
+          </w:p>
+        </w:tc>
+        <w:tc>
+          <w:tcPr>
+            <w:tcW w:type="dxa" w:w="3326"/>
+            <w:vAlign w:val="center"/>
+          </w:tcPr>
+          <w:p>
+            <w:pPr>
+              <w:spacing w:after="40"/>
+            </w:pPr>
+            <w:r>
+              <w:rPr>
+                <w:sz w:val="17"/>
+              </w:rPr>
+              <w:t>Označavanje točnog vremena kada je korisnik primijetio problem.</w:t>
+            </w:r>
+          </w:p>
+        </w:tc>
+      </w:tr>
+    </w:tbl>
+    <w:p>
+      <w:pPr>
+        <w:pStyle w:val="Heading1"/>
+      </w:pPr>
+      <w:r>
+        <w:t>24. Identiteti korisnika i prijave</w:t>
+      </w:r>
+    </w:p>
+    <w:p>
+      <w:r>
+        <w:t>Monitor namjerno razlikuje tri identiteta. Oni mogu biti različiti i ne treba ih automatski izjednačavati.</w:t>
+      </w:r>
+    </w:p>
+    <w:tbl>
+      <w:tblPr>
+        <w:tblStyle w:val="TableGrid"/>
+        <w:tblW w:type="auto" w:w="0"/>
+        <w:jc w:val="center"/>
+        <w:tblLook w:firstColumn="1" w:firstRow="1" w:lastColumn="0" w:lastRow="0" w:noHBand="0" w:noVBand="1" w:val="04A0"/>
+      </w:tblPr>
+      <w:tblGrid>
+        <w:gridCol w:w="3326"/>
+        <w:gridCol w:w="3326"/>
+        <w:gridCol w:w="3326"/>
+      </w:tblGrid>
+      <w:tr>
+        <w:trPr>
+          <w:tblHeader/>
+        </w:trPr>
+        <w:tc>
+          <w:tcPr>
+            <w:tcW w:type="dxa" w:w="3326"/>
+            <w:shd w:fill="0B1B38"/>
+            <w:vAlign w:val="center"/>
+          </w:tcPr>
+          <w:p>
+            <w:pPr>
+              <w:spacing w:after="40"/>
+            </w:pPr>
+            <w:r>
+              <w:rPr>
+                <w:b/>
+                <w:color w:val="FFFFFF"/>
+                <w:sz w:val="17"/>
+              </w:rPr>
+              <w:t>Identitet</w:t>
+            </w:r>
+          </w:p>
+        </w:tc>
+        <w:tc>
+          <w:tcPr>
+            <w:tcW w:type="dxa" w:w="3326"/>
+            <w:shd w:fill="0B1B38"/>
+            <w:vAlign w:val="center"/>
+          </w:tcPr>
+          <w:p>
+            <w:pPr>
+              <w:spacing w:after="40"/>
+            </w:pPr>
+            <w:r>
+              <w:rPr>
+                <w:b/>
+                <w:color w:val="FFFFFF"/>
+                <w:sz w:val="17"/>
+              </w:rPr>
+              <w:t>Primjer</w:t>
+            </w:r>
+          </w:p>
+        </w:tc>
+        <w:tc>
+          <w:tcPr>
+            <w:tcW w:type="dxa" w:w="3326"/>
+            <w:shd w:fill="0B1B38"/>
+            <w:vAlign w:val="center"/>
+          </w:tcPr>
+          <w:p>
+            <w:pPr>
+              <w:spacing w:after="40"/>
+            </w:pPr>
+            <w:r>
+              <w:rPr>
+                <w:b/>
+                <w:color w:val="FFFFFF"/>
+                <w:sz w:val="17"/>
+              </w:rPr>
+              <w:t>Značenje</w:t>
+            </w:r>
+          </w:p>
+        </w:tc>
+      </w:tr>
+      <w:tr>
+        <w:tc>
+          <w:tcPr>
+            <w:tcW w:type="dxa" w:w="3326"/>
+            <w:vAlign w:val="center"/>
+          </w:tcPr>
+          <w:p>
+            <w:pPr>
+              <w:spacing w:after="40"/>
+            </w:pPr>
+            <w:r>
+              <w:rPr>
+                <w:sz w:val="17"/>
+              </w:rPr>
+              <w:t>Windows user</w:t>
+            </w:r>
+          </w:p>
+        </w:tc>
+        <w:tc>
+          <w:tcPr>
+            <w:tcW w:type="dxa" w:w="3326"/>
+            <w:vAlign w:val="center"/>
+          </w:tcPr>
+          <w:p>
+            <w:pPr>
+              <w:spacing w:after="40"/>
+            </w:pPr>
+            <w:r>
+              <w:rPr>
+                <w:sz w:val="17"/>
+              </w:rPr>
+              <w:t>NB-SN\Stjepan</w:t>
+            </w:r>
+          </w:p>
+        </w:tc>
+        <w:tc>
+          <w:tcPr>
+            <w:tcW w:type="dxa" w:w="3326"/>
+            <w:vAlign w:val="center"/>
+          </w:tcPr>
+          <w:p>
+            <w:pPr>
+              <w:spacing w:after="40"/>
+            </w:pPr>
+            <w:r>
+              <w:rPr>
+                <w:sz w:val="17"/>
+              </w:rPr>
+              <w:t>Windows račun pod kojim je lokalni Apross.exe pokrenut.</w:t>
+            </w:r>
+          </w:p>
+        </w:tc>
+      </w:tr>
+      <w:tr>
+        <w:tc>
+          <w:tcPr>
+            <w:tcW w:type="dxa" w:w="3326"/>
+            <w:vAlign w:val="center"/>
+          </w:tcPr>
+          <w:p>
+            <w:pPr>
+              <w:spacing w:after="40"/>
+            </w:pPr>
+            <w:r>
+              <w:rPr>
+                <w:sz w:val="17"/>
+              </w:rPr>
+              <w:t>Apross application user</w:t>
+            </w:r>
+          </w:p>
+        </w:tc>
+        <w:tc>
+          <w:tcPr>
+            <w:tcW w:type="dxa" w:w="3326"/>
+            <w:vAlign w:val="center"/>
+          </w:tcPr>
+          <w:p>
+            <w:pPr>
+              <w:spacing w:after="40"/>
+            </w:pPr>
+            <w:r>
+              <w:rPr>
+                <w:sz w:val="17"/>
+              </w:rPr>
+              <w:t>administrator / blagajna / skladište</w:t>
+            </w:r>
+          </w:p>
+        </w:tc>
+        <w:tc>
+          <w:tcPr>
+            <w:tcW w:type="dxa" w:w="3326"/>
+            <w:vAlign w:val="center"/>
+          </w:tcPr>
+          <w:p>
+            <w:pPr>
+              <w:spacing w:after="40"/>
+            </w:pPr>
+            <w:r>
+              <w:rPr>
+                <w:sz w:val="17"/>
+              </w:rPr>
+              <w:t>Korisnik prijavljen unutar Aprossa. Određuje izbornike i poslovna prava u aplikaciji.</w:t>
+            </w:r>
+          </w:p>
+        </w:tc>
+      </w:tr>
+      <w:tr>
+        <w:tc>
+          <w:tcPr>
+            <w:tcW w:type="dxa" w:w="3326"/>
+            <w:vAlign w:val="center"/>
+          </w:tcPr>
+          <w:p>
+            <w:pPr>
+              <w:spacing w:after="40"/>
+            </w:pPr>
+            <w:r>
+              <w:rPr>
+                <w:sz w:val="17"/>
+              </w:rPr>
+              <w:t>SQL monitoring login</w:t>
+            </w:r>
+          </w:p>
+        </w:tc>
+        <w:tc>
+          <w:tcPr>
+            <w:tcW w:type="dxa" w:w="3326"/>
+            <w:vAlign w:val="center"/>
+          </w:tcPr>
+          <w:p>
+            <w:pPr>
+              <w:spacing w:after="40"/>
+            </w:pPr>
+            <w:r>
+              <w:rPr>
+                <w:sz w:val="17"/>
+              </w:rPr>
+              <w:t>zgdata_monitor ili drugi SQL login</w:t>
+            </w:r>
+          </w:p>
+        </w:tc>
+        <w:tc>
+          <w:tcPr>
+            <w:tcW w:type="dxa" w:w="3326"/>
+            <w:vAlign w:val="center"/>
+          </w:tcPr>
+          <w:p>
+            <w:pPr>
+              <w:spacing w:after="40"/>
+            </w:pPr>
+            <w:r>
+              <w:rPr>
+                <w:sz w:val="17"/>
+              </w:rPr>
+              <w:t>Zaseban credential kojim se Toolkit spaja na SQL Server i čita dijagnostičke DMV podatke.</w:t>
+            </w:r>
+          </w:p>
+        </w:tc>
+      </w:tr>
+    </w:tbl>
+    <w:tbl>
+      <w:tblPr>
+        <w:tblW w:type="auto" w:w="0"/>
+        <w:jc w:val="center"/>
+        <w:tblLook w:firstColumn="1" w:firstRow="1" w:lastColumn="0" w:lastRow="0" w:noHBand="0" w:noVBand="1" w:val="04A0"/>
+      </w:tblPr>
+      <w:tblGrid>
+        <w:gridCol w:w="9978"/>
+      </w:tblGrid>
+      <w:tr>
+        <w:tc>
+          <w:tcPr>
+            <w:tcW w:type="dxa" w:w="9978"/>
+            <w:shd w:fill="FFF4CC"/>
+          </w:tcPr>
+          <w:p>
+            <w:r>
+              <w:rPr>
+                <w:b/>
+                <w:sz w:val="18"/>
+              </w:rPr>
+              <w:t>Sigurnosna preporuka</w:t>
+              <w:br/>
+            </w:r>
+            <w:r>
+              <w:rPr>
+                <w:sz w:val="18"/>
+              </w:rPr>
+              <w:t>Za redoviti rad koristite zaseban SQL monitoring login s minimalnim potrebnim pravima. Nemojte dugoročno koristiti SQL administratora. Lozinka se ne sprema u report, CSV, settings.json ni source kod.</w:t>
+            </w:r>
+          </w:p>
+        </w:tc>
+      </w:tr>
+    </w:tbl>
+    <w:p>
+      <w:pPr>
+        <w:pStyle w:val="Heading1"/>
+      </w:pPr>
+      <w:r>
+        <w:t>25. SQL live correlation</w:t>
+      </w:r>
+    </w:p>
+    <w:p>
+      <w:r>
+        <w:t>SQL live correlation je opcionalna funkcija. Toolkit otvara vlastitu monitoring konekciju prema SQL Serveru i pokušava povezati lokalni TCP port odabranog Apross procesa s odgovarajućom SQL sesijom.</w:t>
+      </w:r>
+    </w:p>
+    <w:tbl>
+      <w:tblPr>
+        <w:tblStyle w:val="TableGrid"/>
+        <w:tblW w:type="auto" w:w="0"/>
+        <w:jc w:val="center"/>
+        <w:tblLook w:firstColumn="1" w:firstRow="1" w:lastColumn="0" w:lastRow="0" w:noHBand="0" w:noVBand="1" w:val="04A0"/>
+      </w:tblPr>
+      <w:tblGrid>
+        <w:gridCol w:w="3326"/>
+        <w:gridCol w:w="3326"/>
+        <w:gridCol w:w="3326"/>
+      </w:tblGrid>
+      <w:tr>
+        <w:trPr>
+          <w:tblHeader/>
+        </w:trPr>
+        <w:tc>
+          <w:tcPr>
+            <w:tcW w:type="dxa" w:w="3326"/>
+            <w:shd w:fill="0B1B38"/>
+            <w:vAlign w:val="center"/>
+          </w:tcPr>
+          <w:p>
+            <w:pPr>
+              <w:spacing w:after="40"/>
+            </w:pPr>
+            <w:r>
+              <w:rPr>
+                <w:b/>
+                <w:color w:val="FFFFFF"/>
+                <w:sz w:val="17"/>
+              </w:rPr>
+              <w:t>Polje</w:t>
+            </w:r>
+          </w:p>
+        </w:tc>
+        <w:tc>
+          <w:tcPr>
+            <w:tcW w:type="dxa" w:w="3326"/>
+            <w:shd w:fill="0B1B38"/>
+            <w:vAlign w:val="center"/>
+          </w:tcPr>
+          <w:p>
+            <w:pPr>
+              <w:spacing w:after="40"/>
+            </w:pPr>
+            <w:r>
+              <w:rPr>
+                <w:b/>
+                <w:color w:val="FFFFFF"/>
+                <w:sz w:val="17"/>
+              </w:rPr>
+              <w:t>Što upisati</w:t>
+            </w:r>
+          </w:p>
+        </w:tc>
+        <w:tc>
+          <w:tcPr>
+            <w:tcW w:type="dxa" w:w="3326"/>
+            <w:shd w:fill="0B1B38"/>
+            <w:vAlign w:val="center"/>
+          </w:tcPr>
+          <w:p>
+            <w:pPr>
+              <w:spacing w:after="40"/>
+            </w:pPr>
+            <w:r>
+              <w:rPr>
+                <w:b/>
+                <w:color w:val="FFFFFF"/>
+                <w:sz w:val="17"/>
+              </w:rPr>
+              <w:t>Napomena</w:t>
+            </w:r>
+          </w:p>
+        </w:tc>
+      </w:tr>
+      <w:tr>
+        <w:tc>
+          <w:tcPr>
+            <w:tcW w:type="dxa" w:w="3326"/>
+            <w:vAlign w:val="center"/>
+          </w:tcPr>
+          <w:p>
+            <w:pPr>
+              <w:spacing w:after="40"/>
+            </w:pPr>
+            <w:r>
+              <w:rPr>
+                <w:sz w:val="17"/>
+              </w:rPr>
+              <w:t>SQL server</w:t>
+            </w:r>
+          </w:p>
+        </w:tc>
+        <w:tc>
+          <w:tcPr>
+            <w:tcW w:type="dxa" w:w="3326"/>
+            <w:vAlign w:val="center"/>
+          </w:tcPr>
+          <w:p>
+            <w:pPr>
+              <w:spacing w:after="40"/>
+            </w:pPr>
+            <w:r>
+              <w:rPr>
+                <w:sz w:val="17"/>
+              </w:rPr>
+              <w:t>DNS ili IP SQL Servera</w:t>
+            </w:r>
+          </w:p>
+        </w:tc>
+        <w:tc>
+          <w:tcPr>
+            <w:tcW w:type="dxa" w:w="3326"/>
+            <w:vAlign w:val="center"/>
+          </w:tcPr>
+          <w:p>
+            <w:pPr>
+              <w:spacing w:after="40"/>
+            </w:pPr>
+            <w:r>
+              <w:rPr>
+                <w:sz w:val="17"/>
+              </w:rPr>
+              <w:t>Treba odgovarati endpointu prema kojem je Apross spojen.</w:t>
+            </w:r>
+          </w:p>
+        </w:tc>
+      </w:tr>
+      <w:tr>
+        <w:tc>
+          <w:tcPr>
+            <w:tcW w:type="dxa" w:w="3326"/>
+            <w:vAlign w:val="center"/>
+          </w:tcPr>
+          <w:p>
+            <w:pPr>
+              <w:spacing w:after="40"/>
+            </w:pPr>
+            <w:r>
+              <w:rPr>
+                <w:sz w:val="17"/>
+              </w:rPr>
+              <w:t>Port</w:t>
+            </w:r>
+          </w:p>
+        </w:tc>
+        <w:tc>
+          <w:tcPr>
+            <w:tcW w:type="dxa" w:w="3326"/>
+            <w:vAlign w:val="center"/>
+          </w:tcPr>
+          <w:p>
+            <w:pPr>
+              <w:spacing w:after="40"/>
+            </w:pPr>
+            <w:r>
+              <w:rPr>
+                <w:sz w:val="17"/>
+              </w:rPr>
+              <w:t>1433, 50000 ili stvarni port</w:t>
+            </w:r>
+          </w:p>
+        </w:tc>
+        <w:tc>
+          <w:tcPr>
+            <w:tcW w:type="dxa" w:w="3326"/>
+            <w:vAlign w:val="center"/>
+          </w:tcPr>
+          <w:p>
+            <w:pPr>
+              <w:spacing w:after="40"/>
+            </w:pPr>
+            <w:r>
+              <w:rPr>
+                <w:sz w:val="17"/>
+              </w:rPr>
+              <w:t>Monitor koristi port za korelaciju konekcije.</w:t>
+            </w:r>
+          </w:p>
+        </w:tc>
+      </w:tr>
+      <w:tr>
+        <w:tc>
+          <w:tcPr>
+            <w:tcW w:type="dxa" w:w="3326"/>
+            <w:vAlign w:val="center"/>
+          </w:tcPr>
+          <w:p>
+            <w:pPr>
+              <w:spacing w:after="40"/>
+            </w:pPr>
+            <w:r>
+              <w:rPr>
+                <w:sz w:val="17"/>
+              </w:rPr>
+              <w:t>Database</w:t>
+            </w:r>
+          </w:p>
+        </w:tc>
+        <w:tc>
+          <w:tcPr>
+            <w:tcW w:type="dxa" w:w="3326"/>
+            <w:vAlign w:val="center"/>
+          </w:tcPr>
+          <w:p>
+            <w:pPr>
+              <w:spacing w:after="40"/>
+            </w:pPr>
+            <w:r>
+              <w:rPr>
+                <w:sz w:val="17"/>
+              </w:rPr>
+              <w:t>Naziv baze ili master</w:t>
+            </w:r>
+          </w:p>
+        </w:tc>
+        <w:tc>
+          <w:tcPr>
+            <w:tcW w:type="dxa" w:w="3326"/>
+            <w:vAlign w:val="center"/>
+          </w:tcPr>
+          <w:p>
+            <w:pPr>
+              <w:spacing w:after="40"/>
+            </w:pPr>
+            <w:r>
+              <w:rPr>
+                <w:sz w:val="17"/>
+              </w:rPr>
+              <w:t>Baza mora biti dostupna SQL monitoring loginu.</w:t>
+            </w:r>
+          </w:p>
+        </w:tc>
+      </w:tr>
+      <w:tr>
+        <w:tc>
+          <w:tcPr>
+            <w:tcW w:type="dxa" w:w="3326"/>
+            <w:vAlign w:val="center"/>
+          </w:tcPr>
+          <w:p>
+            <w:pPr>
+              <w:spacing w:after="40"/>
+            </w:pPr>
+            <w:r>
+              <w:rPr>
+                <w:sz w:val="17"/>
+              </w:rPr>
+              <w:t>Authentication</w:t>
+            </w:r>
+          </w:p>
+        </w:tc>
+        <w:tc>
+          <w:tcPr>
+            <w:tcW w:type="dxa" w:w="3326"/>
+            <w:vAlign w:val="center"/>
+          </w:tcPr>
+          <w:p>
+            <w:pPr>
+              <w:spacing w:after="40"/>
+            </w:pPr>
+            <w:r>
+              <w:rPr>
+                <w:sz w:val="17"/>
+              </w:rPr>
+              <w:t>SQL ili Windows</w:t>
+            </w:r>
+          </w:p>
+        </w:tc>
+        <w:tc>
+          <w:tcPr>
+            <w:tcW w:type="dxa" w:w="3326"/>
+            <w:vAlign w:val="center"/>
+          </w:tcPr>
+          <w:p>
+            <w:pPr>
+              <w:spacing w:after="40"/>
+            </w:pPr>
+            <w:r>
+              <w:rPr>
+                <w:sz w:val="17"/>
+              </w:rPr>
+              <w:t>Za opisano Apross okruženje uobičajeno se koristi SQL.</w:t>
+            </w:r>
+          </w:p>
+        </w:tc>
+      </w:tr>
+      <w:tr>
+        <w:tc>
+          <w:tcPr>
+            <w:tcW w:type="dxa" w:w="3326"/>
+            <w:vAlign w:val="center"/>
+          </w:tcPr>
+          <w:p>
+            <w:pPr>
+              <w:spacing w:after="40"/>
+            </w:pPr>
+            <w:r>
+              <w:rPr>
+                <w:sz w:val="17"/>
+              </w:rPr>
+              <w:t>SQL monitoring login</w:t>
+            </w:r>
+          </w:p>
+        </w:tc>
+        <w:tc>
+          <w:tcPr>
+            <w:tcW w:type="dxa" w:w="3326"/>
+            <w:vAlign w:val="center"/>
+          </w:tcPr>
+          <w:p>
+            <w:pPr>
+              <w:spacing w:after="40"/>
+            </w:pPr>
+            <w:r>
+              <w:rPr>
+                <w:sz w:val="17"/>
+              </w:rPr>
+              <w:t>Pravi SQL Server login</w:t>
+            </w:r>
+          </w:p>
+        </w:tc>
+        <w:tc>
+          <w:tcPr>
+            <w:tcW w:type="dxa" w:w="3326"/>
+            <w:vAlign w:val="center"/>
+          </w:tcPr>
+          <w:p>
+            <w:pPr>
+              <w:spacing w:after="40"/>
+            </w:pPr>
+            <w:r>
+              <w:rPr>
+                <w:sz w:val="17"/>
+              </w:rPr>
+              <w:t>Nije isto što i Apross application user.</w:t>
+            </w:r>
+          </w:p>
+        </w:tc>
+      </w:tr>
+      <w:tr>
+        <w:tc>
+          <w:tcPr>
+            <w:tcW w:type="dxa" w:w="3326"/>
+            <w:vAlign w:val="center"/>
+          </w:tcPr>
+          <w:p>
+            <w:pPr>
+              <w:spacing w:after="40"/>
+            </w:pPr>
+            <w:r>
+              <w:rPr>
+                <w:sz w:val="17"/>
+              </w:rPr>
+              <w:t>Include SQL text</w:t>
+            </w:r>
+          </w:p>
+        </w:tc>
+        <w:tc>
+          <w:tcPr>
+            <w:tcW w:type="dxa" w:w="3326"/>
+            <w:vAlign w:val="center"/>
+          </w:tcPr>
+          <w:p>
+            <w:pPr>
+              <w:spacing w:after="40"/>
+            </w:pPr>
+            <w:r>
+              <w:rPr>
+                <w:sz w:val="17"/>
+              </w:rPr>
+              <w:t>Po potrebi</w:t>
+            </w:r>
+          </w:p>
+        </w:tc>
+        <w:tc>
+          <w:tcPr>
+            <w:tcW w:type="dxa" w:w="3326"/>
+            <w:vAlign w:val="center"/>
+          </w:tcPr>
+          <w:p>
+            <w:pPr>
+              <w:spacing w:after="40"/>
+            </w:pPr>
+            <w:r>
+              <w:rPr>
+                <w:sz w:val="17"/>
+              </w:rPr>
+              <w:t>Može prikazati poslovne vrijednosti; uključivati samo kada je opravdano.</w:t>
+            </w:r>
+          </w:p>
+        </w:tc>
+      </w:tr>
+      <w:tr>
+        <w:tc>
+          <w:tcPr>
+            <w:tcW w:type="dxa" w:w="3326"/>
+            <w:vAlign w:val="center"/>
+          </w:tcPr>
+          <w:p>
+            <w:pPr>
+              <w:spacing w:after="40"/>
+            </w:pPr>
+            <w:r>
+              <w:rPr>
+                <w:sz w:val="17"/>
+              </w:rPr>
+              <w:t>Long request</w:t>
+            </w:r>
+          </w:p>
+        </w:tc>
+        <w:tc>
+          <w:tcPr>
+            <w:tcW w:type="dxa" w:w="3326"/>
+            <w:vAlign w:val="center"/>
+          </w:tcPr>
+          <w:p>
+            <w:pPr>
+              <w:spacing w:after="40"/>
+            </w:pPr>
+            <w:r>
+              <w:rPr>
+                <w:sz w:val="17"/>
+              </w:rPr>
+              <w:t>Npr. 5 sec</w:t>
+            </w:r>
+          </w:p>
+        </w:tc>
+        <w:tc>
+          <w:tcPr>
+            <w:tcW w:type="dxa" w:w="3326"/>
+            <w:vAlign w:val="center"/>
+          </w:tcPr>
+          <w:p>
+            <w:pPr>
+              <w:spacing w:after="40"/>
+            </w:pPr>
+            <w:r>
+              <w:rPr>
+                <w:sz w:val="17"/>
+              </w:rPr>
+              <w:t>Prag nakon kojeg se request smatra dugotrajnim.</w:t>
+            </w:r>
+          </w:p>
+        </w:tc>
+      </w:tr>
+    </w:tbl>
+    <w:p>
+      <w:r>
+        <w:t>Prije START MONITORING kliknite TEST SQL ACCESS. Zeleni rezultat treba potvrditi da su server, login, lozinka i potrebna server-state prava dostupni.</w:t>
+      </w:r>
+    </w:p>
+    <w:p>
+      <w:pPr>
+        <w:pStyle w:val="Heading1"/>
+      </w:pPr>
+      <w:r>
+        <w:t>26. Kako čitati SQL live rezultate</w:t>
+      </w:r>
+    </w:p>
+    <w:tbl>
+      <w:tblPr>
+        <w:tblStyle w:val="TableGrid"/>
+        <w:tblW w:type="auto" w:w="0"/>
+        <w:jc w:val="center"/>
+        <w:tblLook w:firstColumn="1" w:firstRow="1" w:lastColumn="0" w:lastRow="0" w:noHBand="0" w:noVBand="1" w:val="04A0"/>
+      </w:tblPr>
+      <w:tblGrid>
+        <w:gridCol w:w="4989"/>
+        <w:gridCol w:w="4989"/>
+      </w:tblGrid>
+      <w:tr>
+        <w:trPr>
+          <w:tblHeader/>
+        </w:trPr>
+        <w:tc>
+          <w:tcPr>
+            <w:tcW w:type="dxa" w:w="4989"/>
+            <w:shd w:fill="0B1B38"/>
+            <w:vAlign w:val="center"/>
+          </w:tcPr>
+          <w:p>
+            <w:pPr>
+              <w:spacing w:after="40"/>
+            </w:pPr>
+            <w:r>
+              <w:rPr>
+                <w:b/>
+                <w:color w:val="FFFFFF"/>
+                <w:sz w:val="17"/>
+              </w:rPr>
+              <w:t>Polje</w:t>
+            </w:r>
+          </w:p>
+        </w:tc>
+        <w:tc>
+          <w:tcPr>
+            <w:tcW w:type="dxa" w:w="4989"/>
+            <w:shd w:fill="0B1B38"/>
+            <w:vAlign w:val="center"/>
+          </w:tcPr>
+          <w:p>
+            <w:pPr>
+              <w:spacing w:after="40"/>
+            </w:pPr>
+            <w:r>
+              <w:rPr>
+                <w:b/>
+                <w:color w:val="FFFFFF"/>
+                <w:sz w:val="17"/>
+              </w:rPr>
+              <w:t>Tumačenje</w:t>
+            </w:r>
+          </w:p>
+        </w:tc>
+      </w:tr>
+      <w:tr>
+        <w:tc>
+          <w:tcPr>
+            <w:tcW w:type="dxa" w:w="4989"/>
+            <w:vAlign w:val="center"/>
+          </w:tcPr>
+          <w:p>
+            <w:pPr>
+              <w:spacing w:after="40"/>
+            </w:pPr>
+            <w:r>
+              <w:rPr>
+                <w:sz w:val="17"/>
+              </w:rPr>
+              <w:t>SPID / Session ID</w:t>
+            </w:r>
+          </w:p>
+        </w:tc>
+        <w:tc>
+          <w:tcPr>
+            <w:tcW w:type="dxa" w:w="4989"/>
+            <w:vAlign w:val="center"/>
+          </w:tcPr>
+          <w:p>
+            <w:pPr>
+              <w:spacing w:after="40"/>
+            </w:pPr>
+            <w:r>
+              <w:rPr>
+                <w:sz w:val="17"/>
+              </w:rPr>
+              <w:t>SQL Server sesija povezana s Apross klijentom.</w:t>
+            </w:r>
+          </w:p>
+        </w:tc>
+      </w:tr>
+      <w:tr>
+        <w:tc>
+          <w:tcPr>
+            <w:tcW w:type="dxa" w:w="4989"/>
+            <w:vAlign w:val="center"/>
+          </w:tcPr>
+          <w:p>
+            <w:pPr>
+              <w:spacing w:after="40"/>
+            </w:pPr>
+            <w:r>
+              <w:rPr>
+                <w:sz w:val="17"/>
+              </w:rPr>
+              <w:t>Login / Program name</w:t>
+            </w:r>
+          </w:p>
+        </w:tc>
+        <w:tc>
+          <w:tcPr>
+            <w:tcW w:type="dxa" w:w="4989"/>
+            <w:vAlign w:val="center"/>
+          </w:tcPr>
+          <w:p>
+            <w:pPr>
+              <w:spacing w:after="40"/>
+            </w:pPr>
+            <w:r>
+              <w:rPr>
+                <w:sz w:val="17"/>
+              </w:rPr>
+              <w:t>Tehnički SQL login i naziv klijentske aplikacije koje SQL Server vidi.</w:t>
+            </w:r>
+          </w:p>
+        </w:tc>
+      </w:tr>
+      <w:tr>
+        <w:tc>
+          <w:tcPr>
+            <w:tcW w:type="dxa" w:w="4989"/>
+            <w:vAlign w:val="center"/>
+          </w:tcPr>
+          <w:p>
+            <w:pPr>
+              <w:spacing w:after="40"/>
+            </w:pPr>
+            <w:r>
+              <w:rPr>
+                <w:sz w:val="17"/>
+              </w:rPr>
+              <w:t>Database / Command</w:t>
+            </w:r>
+          </w:p>
+        </w:tc>
+        <w:tc>
+          <w:tcPr>
+            <w:tcW w:type="dxa" w:w="4989"/>
+            <w:vAlign w:val="center"/>
+          </w:tcPr>
+          <w:p>
+            <w:pPr>
+              <w:spacing w:after="40"/>
+            </w:pPr>
+            <w:r>
+              <w:rPr>
+                <w:sz w:val="17"/>
+              </w:rPr>
+              <w:t>Baza i vrsta trenutačno aktivnog requesta.</w:t>
+            </w:r>
+          </w:p>
+        </w:tc>
+      </w:tr>
+      <w:tr>
+        <w:tc>
+          <w:tcPr>
+            <w:tcW w:type="dxa" w:w="4989"/>
+            <w:vAlign w:val="center"/>
+          </w:tcPr>
+          <w:p>
+            <w:pPr>
+              <w:spacing w:after="40"/>
+            </w:pPr>
+            <w:r>
+              <w:rPr>
+                <w:sz w:val="17"/>
+              </w:rPr>
+              <w:t>Elapsed</w:t>
+            </w:r>
+          </w:p>
+        </w:tc>
+        <w:tc>
+          <w:tcPr>
+            <w:tcW w:type="dxa" w:w="4989"/>
+            <w:vAlign w:val="center"/>
+          </w:tcPr>
+          <w:p>
+            <w:pPr>
+              <w:spacing w:after="40"/>
+            </w:pPr>
+            <w:r>
+              <w:rPr>
+                <w:sz w:val="17"/>
+              </w:rPr>
+              <w:t>Koliko je aktivni request do sada trajao.</w:t>
+            </w:r>
+          </w:p>
+        </w:tc>
+      </w:tr>
+      <w:tr>
+        <w:tc>
+          <w:tcPr>
+            <w:tcW w:type="dxa" w:w="4989"/>
+            <w:vAlign w:val="center"/>
+          </w:tcPr>
+          <w:p>
+            <w:pPr>
+              <w:spacing w:after="40"/>
+            </w:pPr>
+            <w:r>
+              <w:rPr>
+                <w:sz w:val="17"/>
+              </w:rPr>
+              <w:t>Wait type / Wait time</w:t>
+            </w:r>
+          </w:p>
+        </w:tc>
+        <w:tc>
+          <w:tcPr>
+            <w:tcW w:type="dxa" w:w="4989"/>
+            <w:vAlign w:val="center"/>
+          </w:tcPr>
+          <w:p>
+            <w:pPr>
+              <w:spacing w:after="40"/>
+            </w:pPr>
+            <w:r>
+              <w:rPr>
+                <w:sz w:val="17"/>
+              </w:rPr>
+              <w:t>Na što SQL request čeka i koliko dugo.</w:t>
+            </w:r>
+          </w:p>
+        </w:tc>
+      </w:tr>
+      <w:tr>
+        <w:tc>
+          <w:tcPr>
+            <w:tcW w:type="dxa" w:w="4989"/>
+            <w:vAlign w:val="center"/>
+          </w:tcPr>
+          <w:p>
+            <w:pPr>
+              <w:spacing w:after="40"/>
+            </w:pPr>
+            <w:r>
+              <w:rPr>
+                <w:sz w:val="17"/>
+              </w:rPr>
+              <w:t>Blocking session</w:t>
+            </w:r>
+          </w:p>
+        </w:tc>
+        <w:tc>
+          <w:tcPr>
+            <w:tcW w:type="dxa" w:w="4989"/>
+            <w:vAlign w:val="center"/>
+          </w:tcPr>
+          <w:p>
+            <w:pPr>
+              <w:spacing w:after="40"/>
+            </w:pPr>
+            <w:r>
+              <w:rPr>
+                <w:sz w:val="17"/>
+              </w:rPr>
+              <w:t>SPID druge sesije koja blokira request. Vrijednost 0 znači da nema evidentiranog blokera.</w:t>
+            </w:r>
+          </w:p>
+        </w:tc>
+      </w:tr>
+      <w:tr>
+        <w:tc>
+          <w:tcPr>
+            <w:tcW w:type="dxa" w:w="4989"/>
+            <w:vAlign w:val="center"/>
+          </w:tcPr>
+          <w:p>
+            <w:pPr>
+              <w:spacing w:after="40"/>
+            </w:pPr>
+            <w:r>
+              <w:rPr>
+                <w:sz w:val="17"/>
+              </w:rPr>
+              <w:t>CPU / reads / writes</w:t>
+            </w:r>
+          </w:p>
+        </w:tc>
+        <w:tc>
+          <w:tcPr>
+            <w:tcW w:type="dxa" w:w="4989"/>
+            <w:vAlign w:val="center"/>
+          </w:tcPr>
+          <w:p>
+            <w:pPr>
+              <w:spacing w:after="40"/>
+            </w:pPr>
+            <w:r>
+              <w:rPr>
+                <w:sz w:val="17"/>
+              </w:rPr>
+              <w:t>Opterećenje i količina rada koju je request napravio.</w:t>
+            </w:r>
+          </w:p>
+        </w:tc>
+      </w:tr>
+      <w:tr>
+        <w:tc>
+          <w:tcPr>
+            <w:tcW w:type="dxa" w:w="4989"/>
+            <w:vAlign w:val="center"/>
+          </w:tcPr>
+          <w:p>
+            <w:pPr>
+              <w:spacing w:after="40"/>
+            </w:pPr>
+            <w:r>
+              <w:rPr>
+                <w:sz w:val="17"/>
+              </w:rPr>
+              <w:t>SQL text</w:t>
+            </w:r>
+          </w:p>
+        </w:tc>
+        <w:tc>
+          <w:tcPr>
+            <w:tcW w:type="dxa" w:w="4989"/>
+            <w:vAlign w:val="center"/>
+          </w:tcPr>
+          <w:p>
+            <w:pPr>
+              <w:spacing w:after="40"/>
+            </w:pPr>
+            <w:r>
+              <w:rPr>
+                <w:sz w:val="17"/>
+              </w:rPr>
+              <w:t>Opcionalni tekst requesta. Može sadržavati poslovne podatke i treba ga pažljivo dijeliti.</w:t>
+            </w:r>
+          </w:p>
+        </w:tc>
+      </w:tr>
+    </w:tbl>
+    <w:p>
+      <w:r>
+        <w:t>Primjeri zaključivanja:</w:t>
+      </w:r>
+    </w:p>
+    <w:p>
+      <w:pPr>
+        <w:pStyle w:val="ListBullet"/>
+      </w:pPr>
+      <w:r>
+        <w:t>Apross je Not responding, a SQL request dugo čeka uz blocking session: najvjerojatniji uzrok je SQL blocking.</w:t>
+      </w:r>
+    </w:p>
+    <w:p>
+      <w:pPr>
+        <w:pStyle w:val="ListBullet"/>
+      </w:pPr>
+      <w:r>
+        <w:t>SQL request dugo traje bez network grešaka i bez blokera: provjeriti upit, plan izvršavanja, disk i opterećenje servera.</w:t>
+      </w:r>
+    </w:p>
+    <w:p>
+      <w:pPr>
+        <w:pStyle w:val="ListBullet"/>
+      </w:pPr>
+      <w:r>
+        <w:t>Apross je Not responding, ali nema aktivne SQL sesije: provjeriti lokalni UI, WebView2, report helper, file share ili drugi endpoint.</w:t>
+      </w:r>
+    </w:p>
+    <w:p>
+      <w:pPr>
+        <w:pStyle w:val="ListBullet"/>
+      </w:pPr>
+      <w:r>
+        <w:t>Korisnik označi problem, a istodobno se zatvara SQL ili Web/API veza: pregledati timeline i detailed trace.</w:t>
+      </w:r>
+    </w:p>
+    <w:p>
+      <w:pPr>
+        <w:pStyle w:val="Heading1"/>
+      </w:pPr>
+      <w:r>
+        <w:t>27. Ograničenja i privatnost Apross Monitora</w:t>
+      </w:r>
+    </w:p>
+    <w:p>
+      <w:pPr>
+        <w:pStyle w:val="ListBullet"/>
+      </w:pPr>
+      <w:r>
+        <w:t>Live SQL polling uzima uzorke približno jednom u sekundi. Vrlo kratki upiti mogu završiti između dva uzorka.</w:t>
+      </w:r>
+    </w:p>
+    <w:p>
+      <w:pPr>
+        <w:pStyle w:val="ListBullet"/>
+      </w:pPr>
+      <w:r>
+        <w:t>Metadata način ne sprema sadržaj mrežnih paketa.</w:t>
+      </w:r>
+    </w:p>
+    <w:p>
+      <w:pPr>
+        <w:pStyle w:val="ListBullet"/>
+      </w:pPr>
+      <w:r>
+        <w:t>Detailed packet trace traži administratorska prava i može sadržavati promet drugih procesa.</w:t>
+      </w:r>
+    </w:p>
+    <w:p>
+      <w:pPr>
+        <w:pStyle w:val="ListBullet"/>
+      </w:pPr>
+      <w:r>
+        <w:t>HTTPS sadržaj, puni URL, parametri i poslovni payload u pravilu nisu čitljivi bez dodatne integracije.</w:t>
+      </w:r>
+    </w:p>
+    <w:p>
+      <w:pPr>
+        <w:pStyle w:val="ListBullet"/>
+      </w:pPr>
+      <w:r>
+        <w:t>SQL tekst može sadržavati poslovne podatke i po zadanim postavkama treba ostati isključen.</w:t>
+      </w:r>
+    </w:p>
+    <w:p>
+      <w:pPr>
+        <w:pStyle w:val="ListBullet"/>
+      </w:pPr>
+      <w:r>
+        <w:t>Apross application user je informacija koju operater upisuje; SQL login koji server stvarno vidi prikazuje SQL korelacija.</w:t>
+      </w:r>
+    </w:p>
+    <w:p>
+      <w:pPr>
+        <w:pStyle w:val="Heading1"/>
+      </w:pPr>
+      <w:r>
+        <w:t>28. Preporučeni Apross dijagnostički postupak</w:t>
+      </w:r>
+    </w:p>
+    <w:p>
+      <w:pPr>
+        <w:pStyle w:val="ListNumber"/>
+      </w:pPr>
+      <w:r>
+        <w:t>Pokrenite ZgData Toolkit na istom računalu na kojem korisnik radi u Aprossu.</w:t>
+      </w:r>
+    </w:p>
+    <w:p>
+      <w:pPr>
+        <w:pStyle w:val="ListNumber"/>
+      </w:pPr>
+      <w:r>
+        <w:t>Odaberite pravi Apross PID i upišite Apross application user.</w:t>
+      </w:r>
+    </w:p>
+    <w:p>
+      <w:pPr>
+        <w:pStyle w:val="ListNumber"/>
+      </w:pPr>
+      <w:r>
+        <w:t>Pokrenite kratki metadata test bez detailed tracea.</w:t>
+      </w:r>
+    </w:p>
+    <w:p>
+      <w:pPr>
+        <w:pStyle w:val="ListNumber"/>
+      </w:pPr>
+      <w:r>
+        <w:t>Uključite SQL live correlation kada imate SQL monitoring login i potreban server-state permission.</w:t>
+      </w:r>
+    </w:p>
+    <w:p>
+      <w:pPr>
+        <w:pStyle w:val="ListNumber"/>
+      </w:pPr>
+      <w:r>
+        <w:t>Zamolite korisnika da ponovi radnju koja stvara problem.</w:t>
+      </w:r>
+    </w:p>
+    <w:p>
+      <w:pPr>
+        <w:pStyle w:val="ListNumber"/>
+      </w:pPr>
+      <w:r>
+        <w:t>U trenutku problema kliknite PROBLEM HAPPENED i upišite naziv ekrana, reporta ili radnje.</w:t>
+      </w:r>
+    </w:p>
+    <w:p>
+      <w:pPr>
+        <w:pStyle w:val="ListNumber"/>
+      </w:pPr>
+      <w:r>
+        <w:t>Nakon problema pričekajte još najmanje 30-60 sekundi i kliknite STOP &amp; CREATE REPORT.</w:t>
+      </w:r>
+    </w:p>
+    <w:p>
+      <w:pPr>
+        <w:pStyle w:val="ListNumber"/>
+      </w:pPr>
+      <w:r>
+        <w:t>Uz HTML report pošaljite CSV datoteke, približno vrijeme problema i opis korisnikove radnje.</w:t>
+      </w:r>
+    </w:p>
+    <w:tbl>
+      <w:tblPr>
+        <w:tblW w:type="auto" w:w="0"/>
+        <w:jc w:val="center"/>
+        <w:tblLook w:firstColumn="1" w:firstRow="1" w:lastColumn="0" w:lastRow="0" w:noHBand="0" w:noVBand="1" w:val="04A0"/>
+      </w:tblPr>
+      <w:tblGrid>
+        <w:gridCol w:w="9978"/>
+      </w:tblGrid>
+      <w:tr>
+        <w:tc>
+          <w:tcPr>
+            <w:tcW w:type="dxa" w:w="9978"/>
+            <w:shd w:fill="E8F5E9"/>
+          </w:tcPr>
+          <w:p>
+            <w:r>
+              <w:rPr>
+                <w:b/>
+                <w:sz w:val="18"/>
+              </w:rPr>
+              <w:t>Praktičan savjet</w:t>
+              <w:br/>
+            </w:r>
+            <w:r>
+              <w:rPr>
+                <w:sz w:val="18"/>
+              </w:rPr>
+              <w:t>Za povremene probleme monitor ostavite aktivnim tijekom stvarnog rada korisnika. Problem marker je najvrjedniji kada korisnik klikne odmah u trenutku zastoja.</w:t>
+            </w:r>
+          </w:p>
+        </w:tc>
+      </w:tr>
+    </w:tbl>
     <w:sectPr>
       <w:headerReference w:type="default" r:id="rId9"/>
       <w:footerReference w:type="default" r:id="rId10"/>

</xml_diff>